<commit_message>
Memo: igualar formato del memo hecho a mano
Ajusta la plantilla del memo para que coincida con el ejemplo elaborado
manualmente:
- El objeto de la contratacion y el numero de cotizaciones salen en AZUL y
  negrita dentro del contexto.
- Los parrafos legales recuperan su formato: negritas en las citas
  normativas, cita en negrita/cursiva/subrayado, el parrafo "Asi mismo..."
  completo en negrita-cursiva y "De lo anterior..." en cursiva con la frase
  clave en negrita.
- La tabla de postores va toda en negrita (Arial 8).
- El bloque final (EXP. DIR./EXP. LOG./Folios/Elaborado por) en Arial 8 con
  las etiquetas en negrita.
- Nombres del destinatario/remitente en Arial 10.5 negrita.
- Se elimina el N° de memorando (se agrega a mano); queda el espacio en el
  titulo.

Co-Authored-By: Claude Opus 4.8 <noreply@anthropic.com>
Claude-Session: https://claude.ai/code/session_01S69ej8Vgbpjdhn84ABgydA
</commit_message>
<xml_diff>
--- a/plantilla/MEMO_VALIDACION.docx
+++ b/plantilla/MEMO_VALIDACION.docx
@@ -21,27 +21,7 @@
           <w:sz w:val="32"/>
           <w:szCs w:val="32"/>
         </w:rPr>
-        <w:t xml:space="preserve">MEMORANDO N° </w:t>
-      </w:r>
-      <w:r>
-        <w:rPr>
-          <w:rFonts w:ascii="Cambria" w:hAnsi="Cambria" w:cs="Cambria"/>
-          <w:b/>
-          <w:u w:val="single"/>
-          <w:sz w:val="32"/>
-          <w:szCs w:val="32"/>
-        </w:rPr>
-        <w:t xml:space="preserve">{memoNum}</w:t>
-      </w:r>
-      <w:r>
-        <w:rPr>
-          <w:rFonts w:ascii="Cambria" w:hAnsi="Cambria" w:cs="Cambria"/>
-          <w:b/>
-          <w:u w:val="single"/>
-          <w:sz w:val="32"/>
-          <w:szCs w:val="32"/>
-        </w:rPr>
-        <w:t xml:space="preserve"> -OL-J- H.N.A.L.-</w:t>
+        <w:t xml:space="preserve">MEMORANDO N°            -OL-J- H.N.A.L.-</w:t>
       </w:r>
       <w:r>
         <w:rPr>
@@ -132,18 +112,18 @@
               <w:spacing w:after="0" w:line="240" w:lineRule="auto"/>
               <w:jc w:val="left"/>
               <w:rPr>
-                <w:rFonts w:ascii="Arial Narrow" w:hAnsi="Arial Narrow" w:cs="Arial Narrow"/>
+                <w:rFonts w:ascii="Arial" w:hAnsi="Arial" w:cs="Arial"/>
                 <w:b/>
-                <w:sz w:val="24"/>
-                <w:szCs w:val="24"/>
+                <w:sz w:val="21"/>
+                <w:szCs w:val="21"/>
               </w:rPr>
             </w:pPr>
             <w:r>
               <w:rPr>
-                <w:rFonts w:ascii="Arial Narrow" w:hAnsi="Arial Narrow" w:cs="Arial Narrow"/>
+                <w:rFonts w:ascii="Arial" w:hAnsi="Arial" w:cs="Arial"/>
                 <w:b/>
-                <w:sz w:val="24"/>
-                <w:szCs w:val="24"/>
+                <w:sz w:val="21"/>
+                <w:szCs w:val="21"/>
               </w:rPr>
               <w:t xml:space="preserve">{destNombre}</w:t>
             </w:r>
@@ -153,16 +133,18 @@
               <w:spacing w:after="0" w:line="240" w:lineRule="auto"/>
               <w:jc w:val="left"/>
               <w:rPr>
-                <w:rFonts w:ascii="Arial Narrow" w:hAnsi="Arial Narrow" w:cs="Arial Narrow"/>
-                <w:sz w:val="20"/>
-                <w:szCs w:val="20"/>
+                <w:rFonts w:ascii="Arial" w:hAnsi="Arial" w:cs="Arial"/>
+                <w:b/>
+                <w:sz w:val="21"/>
+                <w:szCs w:val="21"/>
               </w:rPr>
             </w:pPr>
             <w:r>
               <w:rPr>
-                <w:rFonts w:ascii="Arial Narrow" w:hAnsi="Arial Narrow" w:cs="Arial Narrow"/>
-                <w:sz w:val="20"/>
-                <w:szCs w:val="20"/>
+                <w:rFonts w:ascii="Arial" w:hAnsi="Arial" w:cs="Arial"/>
+                <w:b/>
+                <w:sz w:val="21"/>
+                <w:szCs w:val="21"/>
               </w:rPr>
               <w:t xml:space="preserve">{destCargo}</w:t>
             </w:r>
@@ -232,16 +214,16 @@
               <w:rPr>
                 <w:rFonts w:ascii="Arial" w:hAnsi="Arial" w:cs="Arial"/>
                 <w:b/>
-                <w:sz w:val="20"/>
-                <w:szCs w:val="20"/>
+                <w:sz w:val="21"/>
+                <w:szCs w:val="21"/>
               </w:rPr>
             </w:pPr>
             <w:r>
               <w:rPr>
                 <w:rFonts w:ascii="Arial" w:hAnsi="Arial" w:cs="Arial"/>
                 <w:b/>
-                <w:sz w:val="20"/>
-                <w:szCs w:val="20"/>
+                <w:sz w:val="21"/>
+                <w:szCs w:val="21"/>
               </w:rPr>
               <w:t xml:space="preserve">{remNombre}</w:t>
             </w:r>
@@ -251,14 +233,14 @@
               <w:spacing w:after="0" w:line="240" w:lineRule="auto"/>
               <w:jc w:val="left"/>
               <w:rPr>
-                <w:rFonts w:ascii="Arial" w:hAnsi="Arial" w:cs="Arial"/>
+                <w:rFonts w:ascii="Arial Narrow" w:hAnsi="Arial Narrow" w:cs="Arial Narrow"/>
                 <w:sz w:val="20"/>
                 <w:szCs w:val="20"/>
               </w:rPr>
             </w:pPr>
             <w:r>
               <w:rPr>
-                <w:rFonts w:ascii="Arial" w:hAnsi="Arial" w:cs="Arial"/>
+                <w:rFonts w:ascii="Arial Narrow" w:hAnsi="Arial Narrow" w:cs="Arial Narrow"/>
                 <w:sz w:val="20"/>
                 <w:szCs w:val="20"/>
               </w:rPr>
@@ -339,16 +321,7 @@
                 <w:sz w:val="20"/>
                 <w:szCs w:val="20"/>
               </w:rPr>
-              <w:t xml:space="preserve">Solicitud de Revisión y Evaluación de Cumplimiento de </w:t>
-            </w:r>
-            <w:r>
-              <w:rPr>
-                <w:rFonts w:ascii="Arial Narrow" w:hAnsi="Arial Narrow" w:cs="Arial Narrow"/>
-                <w:b/>
-                <w:sz w:val="20"/>
-                <w:szCs w:val="20"/>
-              </w:rPr>
-              <w:t xml:space="preserve">{asunto}</w:t>
+              <w:t xml:space="preserve">Solicitud de Revisión y Evaluación de Cumplimiento de {asunto}</w:t>
             </w:r>
           </w:p>
         </w:tc>
@@ -572,6 +545,7 @@
         <w:rPr>
           <w:rFonts w:ascii="Arial" w:hAnsi="Arial" w:cs="Arial"/>
           <w:b/>
+          <w:color w:val="0000FF"/>
           <w:sz w:val="16"/>
           <w:szCs w:val="16"/>
         </w:rPr>
@@ -597,10 +571,11 @@
         <w:rPr>
           <w:rFonts w:ascii="Arial" w:hAnsi="Arial" w:cs="Arial"/>
           <w:b/>
+          <w:color w:val="0000FF"/>
           <w:sz w:val="16"/>
           <w:szCs w:val="16"/>
         </w:rPr>
-        <w:t xml:space="preserve">{cantidad}</w:t>
+        <w:t xml:space="preserve">{cantidad} cotizaciones</w:t>
       </w:r>
       <w:r>
         <w:rPr>
@@ -608,7 +583,7 @@
           <w:sz w:val="16"/>
           <w:szCs w:val="16"/>
         </w:rPr>
-        <w:t xml:space="preserve"> cotizaciones a solicitud de </w:t>
+        <w:t xml:space="preserve"> a solicitud de </w:t>
       </w:r>
       <w:r>
         <w:rPr>
@@ -782,6 +757,7 @@
               <w:jc w:val="center"/>
               <w:rPr>
                 <w:rFonts w:ascii="Arial" w:hAnsi="Arial" w:cs="Arial"/>
+                <w:b/>
                 <w:sz w:val="16"/>
                 <w:szCs w:val="16"/>
               </w:rPr>
@@ -789,6 +765,7 @@
             <w:r>
               <w:rPr>
                 <w:rFonts w:ascii="Arial" w:hAnsi="Arial" w:cs="Arial"/>
+                <w:b/>
                 <w:sz w:val="16"/>
                 <w:szCs w:val="16"/>
               </w:rPr>
@@ -807,6 +784,7 @@
               <w:jc w:val="center"/>
               <w:rPr>
                 <w:rFonts w:ascii="Arial" w:hAnsi="Arial" w:cs="Arial"/>
+                <w:b/>
                 <w:sz w:val="16"/>
                 <w:szCs w:val="16"/>
               </w:rPr>
@@ -814,6 +792,7 @@
             <w:r>
               <w:rPr>
                 <w:rFonts w:ascii="Arial" w:hAnsi="Arial" w:cs="Arial"/>
+                <w:b/>
                 <w:sz w:val="16"/>
                 <w:szCs w:val="16"/>
               </w:rPr>
@@ -832,6 +811,7 @@
               <w:jc w:val="center"/>
               <w:rPr>
                 <w:rFonts w:ascii="Arial" w:hAnsi="Arial" w:cs="Arial"/>
+                <w:b/>
                 <w:sz w:val="16"/>
                 <w:szCs w:val="16"/>
               </w:rPr>
@@ -839,6 +819,7 @@
             <w:r>
               <w:rPr>
                 <w:rFonts w:ascii="Arial" w:hAnsi="Arial" w:cs="Arial"/>
+                <w:b/>
                 <w:sz w:val="16"/>
                 <w:szCs w:val="16"/>
               </w:rPr>
@@ -857,6 +838,7 @@
               <w:jc w:val="center"/>
               <w:rPr>
                 <w:rFonts w:ascii="Arial" w:hAnsi="Arial" w:cs="Arial"/>
+                <w:b/>
                 <w:sz w:val="16"/>
                 <w:szCs w:val="16"/>
               </w:rPr>
@@ -864,6 +846,7 @@
             <w:r>
               <w:rPr>
                 <w:rFonts w:ascii="Arial" w:hAnsi="Arial" w:cs="Arial"/>
+                <w:b/>
                 <w:sz w:val="16"/>
                 <w:szCs w:val="16"/>
               </w:rPr>
@@ -889,17 +872,110 @@
         <w:jc w:val="both"/>
         <w:rPr>
           <w:rFonts w:ascii="Arial" w:hAnsi="Arial" w:cs="Arial"/>
+          <w:sz w:val="16"/>
+          <w:szCs w:val="16"/>
+        </w:rPr>
+      </w:pPr>
+      <w:r>
+        <w:rPr>
+          <w:rFonts w:ascii="Arial" w:hAnsi="Arial" w:cs="Arial"/>
+          <w:sz w:val="16"/>
+          <w:szCs w:val="16"/>
+        </w:rPr>
+        <w:t xml:space="preserve">Sobre el particular se hace de conocimiento, que se ha enviado a diferentes empresas de los cuales se obtuvo cotizaciones, se solicita si está de acuerdo con las especificaciones técnicas</w:t>
+      </w:r>
+    </w:p>
+    <w:p>
+      <w:pPr>
+        <w:spacing w:after="0" w:line="240" w:lineRule="auto"/>
+        <w:rPr>
+          <w:rFonts w:ascii="Arial" w:hAnsi="Arial" w:cs="Arial"/>
           <w:sz w:val="14"/>
           <w:szCs w:val="14"/>
         </w:rPr>
       </w:pPr>
-      <w:r>
+    </w:p>
+    <w:p>
+      <w:pPr>
+        <w:spacing w:after="0" w:line="240" w:lineRule="auto"/>
+        <w:jc w:val="both"/>
         <w:rPr>
           <w:rFonts w:ascii="Arial" w:hAnsi="Arial" w:cs="Arial"/>
           <w:sz w:val="14"/>
           <w:szCs w:val="14"/>
         </w:rPr>
-        <w:t xml:space="preserve">Sobre el particular se hace de conocimiento, que se ha enviado a diferentes empresas de los cuales se obtuvo cotizaciones, se solicita si está de acuerdo con las especificaciones técnicas</w:t>
+      </w:pPr>
+      <w:r>
+        <w:rPr>
+          <w:rFonts w:ascii="Arial" w:hAnsi="Arial" w:cs="Arial"/>
+          <w:sz w:val="14"/>
+          <w:szCs w:val="14"/>
+        </w:rPr>
+        <w:t xml:space="preserve">De acuerdo al</w:t>
+      </w:r>
+      <w:r>
+        <w:rPr>
+          <w:rFonts w:ascii="Arial" w:hAnsi="Arial" w:cs="Arial"/>
+          <w:b/>
+          <w:sz w:val="14"/>
+          <w:szCs w:val="14"/>
+        </w:rPr>
+        <w:t xml:space="preserve"> Numeral 44.6 del Artículo 44°</w:t>
+      </w:r>
+      <w:r>
+        <w:rPr>
+          <w:rFonts w:ascii="Arial" w:hAnsi="Arial" w:cs="Arial"/>
+          <w:sz w:val="14"/>
+          <w:szCs w:val="14"/>
+        </w:rPr>
+        <w:t xml:space="preserve"> del Reglamento de la Ley General de Contrataciones públicas, </w:t>
+      </w:r>
+      <w:r>
+        <w:rPr>
+          <w:rFonts w:ascii="Arial" w:hAnsi="Arial" w:cs="Arial"/>
+          <w:b/>
+          <w:sz w:val="14"/>
+          <w:szCs w:val="14"/>
+        </w:rPr>
+        <w:t xml:space="preserve">señala lo siguiente</w:t>
+      </w:r>
+      <w:r>
+        <w:rPr>
+          <w:rFonts w:ascii="Arial" w:hAnsi="Arial" w:cs="Arial"/>
+          <w:sz w:val="14"/>
+          <w:szCs w:val="14"/>
+        </w:rPr>
+        <w:t xml:space="preserve">: </w:t>
+      </w:r>
+      <w:r>
+        <w:rPr>
+          <w:rFonts w:ascii="Arial" w:hAnsi="Arial" w:cs="Arial"/>
+          <w:i/>
+          <w:sz w:val="14"/>
+          <w:szCs w:val="14"/>
+        </w:rPr>
+        <w:t xml:space="preserve">“</w:t>
+      </w:r>
+      <w:r>
+        <w:rPr>
+          <w:rFonts w:ascii="Arial" w:hAnsi="Arial" w:cs="Arial"/>
+          <w:b/>
+          <w:i/>
+          <w:u w:val="single"/>
+          <w:sz w:val="14"/>
+          <w:szCs w:val="14"/>
+        </w:rPr>
+        <w:t xml:space="preserve">El requerimiento no incluye exigencias desproporcionadas e innecesarias que limiten la concurrencia o favorezcan a determinado proveedor ni hace referencia a procedencia , fabricante , marca, patente, origen o tipos de producción, ni descripción que oriente la contratación hacía ellos,</w:t>
+      </w:r>
+      <w:r>
+        <w:rPr>
+          <w:rFonts w:ascii="Arial" w:hAnsi="Arial" w:cs="Arial"/>
+          <w:b/>
+          <w:i/>
+          <w:sz w:val="14"/>
+          <w:szCs w:val="14"/>
+        </w:rPr>
+        <w:t xml:space="preserve"> salvo que la autoridad de la gestión administrativa haya aprobado el correspondiente proceso de compatibilización del requerimiento, conforme a las disposiciones que establezca la DGA mediante directiva”</w:t>
       </w:r>
     </w:p>
     <w:p>
@@ -925,10 +1001,12 @@
       <w:r>
         <w:rPr>
           <w:rFonts w:ascii="Arial" w:hAnsi="Arial" w:cs="Arial"/>
+          <w:b/>
+          <w:i/>
           <w:sz w:val="14"/>
           <w:szCs w:val="14"/>
         </w:rPr>
-        <w:t xml:space="preserve">De acuerdo al Numeral 44.6 del Artículo 44° del Reglamento de la Ley General de Contrataciones públicas, señala lo siguiente: “El requerimiento no incluye exigencias desproporcionadas e innecesarias que limiten la concurrencia o favorezcan a determinado proveedor ni hace referencia a procedencia , fabricante , marca, patente, origen o tipos de producción, ni descripción que oriente la contratación hacía ellos, salvo que la autoridad de la gestión administrativa haya aprobado el correspondiente proceso de compatibilización del requerimiento, conforme a las disposiciones que establezca la DGA mediante directiva”</w:t>
+        <w:t xml:space="preserve">Así mismo, el área usuaria tiene la responsabilidad técnica en la elaboración del requerimiento, precisos y objetivos mediante una participación activa en la evaluación de las cotizaciones asegurando que estas cumplan con las especificaciones técnicas, conforme al numeral 14.2 del Artículo 14º y Articulo 20 del Reglamento de la Ley de Contrataciones Públicas.</w:t>
       </w:r>
     </w:p>
     <w:p>
@@ -954,39 +1032,30 @@
       <w:r>
         <w:rPr>
           <w:rFonts w:ascii="Arial" w:hAnsi="Arial" w:cs="Arial"/>
+          <w:i/>
           <w:sz w:val="14"/>
           <w:szCs w:val="14"/>
         </w:rPr>
-        <w:t xml:space="preserve">Así mismo, el área usuaria tiene la responsabilidad técnica en la elaboración del requerimiento, precisos y objetivos mediante una participación activa en la evaluación de las cotizaciones asegurando que estas cumplan con las especificaciones técnicas, conforme al numeral 14.2 del Artículo 14º y Articulo 20 del Reglamento de la Ley de Contrataciones Públicas.</w:t>
-      </w:r>
-    </w:p>
-    <w:p>
-      <w:pPr>
-        <w:spacing w:after="0" w:line="240" w:lineRule="auto"/>
-        <w:rPr>
-          <w:rFonts w:ascii="Arial" w:hAnsi="Arial" w:cs="Arial"/>
+        <w:t xml:space="preserve">De lo anterior, en caso la cotización no cumpla con los términos de referencia y/o Especificaciones Técnicas requeridos, </w:t>
+      </w:r>
+      <w:r>
+        <w:rPr>
+          <w:rFonts w:ascii="Arial" w:hAnsi="Arial" w:cs="Arial"/>
+          <w:b/>
+          <w:i/>
           <w:sz w:val="14"/>
           <w:szCs w:val="14"/>
         </w:rPr>
-      </w:pPr>
-    </w:p>
-    <w:p>
-      <w:pPr>
-        <w:spacing w:after="0" w:line="240" w:lineRule="auto"/>
-        <w:jc w:val="both"/>
-        <w:rPr>
-          <w:rFonts w:ascii="Arial" w:hAnsi="Arial" w:cs="Arial"/>
+        <w:t xml:space="preserve">deberá indicar el motivo de manera clara y objetiva</w:t>
+      </w:r>
+      <w:r>
+        <w:rPr>
+          <w:rFonts w:ascii="Arial" w:hAnsi="Arial" w:cs="Arial"/>
+          <w:i/>
           <w:sz w:val="14"/>
           <w:szCs w:val="14"/>
         </w:rPr>
-      </w:pPr>
-      <w:r>
-        <w:rPr>
-          <w:rFonts w:ascii="Arial" w:hAnsi="Arial" w:cs="Arial"/>
-          <w:sz w:val="14"/>
-          <w:szCs w:val="14"/>
-        </w:rPr>
-        <w:t xml:space="preserve">De lo anterior, en caso la cotización no cumpla con los términos de referencia y/o Especificaciones Técnicas requeridos, deberá indicar el motivo de manera clara y objetiva considerando lo consignado en el Numeral 46.4 del Artículo 46 de la LGCP, así como los principios que rigen la contratación pública contenidos en el Artículo 5 de la Ley General de las Contrataciones Públicas.</w:t>
+        <w:t xml:space="preserve"> considerando lo consignado en el Numeral 46.4 del Artículo 46 de la LGCP, así como los principios que rigen la contratación pública contenidos en el Artículo 5 de la Ley General de las Contrataciones Públicas.</w:t>
       </w:r>
     </w:p>
     <w:p>
@@ -1083,16 +1152,17 @@
         <w:spacing w:after="0" w:line="240" w:lineRule="auto"/>
         <w:jc w:val="left"/>
         <w:rPr>
-          <w:rFonts w:ascii="Arial Narrow" w:hAnsi="Arial Narrow" w:cs="Arial Narrow"/>
-          <w:sz w:val="20"/>
-          <w:szCs w:val="20"/>
-        </w:rPr>
-      </w:pPr>
-      <w:r>
-        <w:rPr>
-          <w:rFonts w:ascii="Arial Narrow" w:hAnsi="Arial Narrow" w:cs="Arial Narrow"/>
-          <w:sz w:val="20"/>
-          <w:szCs w:val="20"/>
+          <w:rFonts w:ascii="Arial" w:hAnsi="Arial" w:cs="Arial"/>
+          <w:sz w:val="16"/>
+          <w:szCs w:val="16"/>
+        </w:rPr>
+      </w:pPr>
+      <w:r>
+        <w:rPr>
+          <w:rFonts w:ascii="Arial" w:hAnsi="Arial" w:cs="Arial"/>
+          <w:b/>
+          <w:sz w:val="16"/>
+          <w:szCs w:val="16"/>
         </w:rPr>
         <w:t xml:space="preserve">EXP. DIR.: {expDir}</w:t>
       </w:r>
@@ -1103,16 +1173,17 @@
         <w:spacing w:after="0" w:line="240" w:lineRule="auto"/>
         <w:jc w:val="left"/>
         <w:rPr>
-          <w:rFonts w:ascii="Arial Narrow" w:hAnsi="Arial Narrow" w:cs="Arial Narrow"/>
-          <w:sz w:val="20"/>
-          <w:szCs w:val="20"/>
-        </w:rPr>
-      </w:pPr>
-      <w:r>
-        <w:rPr>
-          <w:rFonts w:ascii="Arial Narrow" w:hAnsi="Arial Narrow" w:cs="Arial Narrow"/>
-          <w:sz w:val="20"/>
-          <w:szCs w:val="20"/>
+          <w:rFonts w:ascii="Arial" w:hAnsi="Arial" w:cs="Arial"/>
+          <w:sz w:val="16"/>
+          <w:szCs w:val="16"/>
+        </w:rPr>
+      </w:pPr>
+      <w:r>
+        <w:rPr>
+          <w:rFonts w:ascii="Arial" w:hAnsi="Arial" w:cs="Arial"/>
+          <w:b/>
+          <w:sz w:val="16"/>
+          <w:szCs w:val="16"/>
         </w:rPr>
         <w:t xml:space="preserve">EXP. LOG. {expLog}</w:t>
       </w:r>
@@ -1123,18 +1194,35 @@
         <w:spacing w:after="0" w:line="240" w:lineRule="auto"/>
         <w:jc w:val="left"/>
         <w:rPr>
-          <w:rFonts w:ascii="Arial Narrow" w:hAnsi="Arial Narrow" w:cs="Arial Narrow"/>
-          <w:sz w:val="20"/>
-          <w:szCs w:val="20"/>
-        </w:rPr>
-      </w:pPr>
-      <w:r>
-        <w:rPr>
-          <w:rFonts w:ascii="Arial Narrow" w:hAnsi="Arial Narrow" w:cs="Arial Narrow"/>
-          <w:sz w:val="20"/>
-          <w:szCs w:val="20"/>
-        </w:rPr>
-        <w:t xml:space="preserve">Folios: ( {folios} ) original</w:t>
+          <w:rFonts w:ascii="Arial" w:hAnsi="Arial" w:cs="Arial"/>
+          <w:sz w:val="16"/>
+          <w:szCs w:val="16"/>
+        </w:rPr>
+      </w:pPr>
+      <w:r>
+        <w:rPr>
+          <w:rFonts w:ascii="Arial" w:hAnsi="Arial" w:cs="Arial"/>
+          <w:sz w:val="16"/>
+          <w:szCs w:val="16"/>
+        </w:rPr>
+        <w:t xml:space="preserve">Folios: </w:t>
+      </w:r>
+      <w:r>
+        <w:rPr>
+          <w:rFonts w:ascii="Arial" w:hAnsi="Arial" w:cs="Arial"/>
+          <w:b/>
+          <w:sz w:val="16"/>
+          <w:szCs w:val="16"/>
+        </w:rPr>
+        <w:t xml:space="preserve">( {folios} )</w:t>
+      </w:r>
+      <w:r>
+        <w:rPr>
+          <w:rFonts w:ascii="Arial" w:hAnsi="Arial" w:cs="Arial"/>
+          <w:sz w:val="16"/>
+          <w:szCs w:val="16"/>
+        </w:rPr>
+        <w:t xml:space="preserve"> original</w:t>
       </w:r>
     </w:p>
     <w:p>
@@ -1143,16 +1231,16 @@
         <w:spacing w:after="0" w:line="240" w:lineRule="auto"/>
         <w:jc w:val="left"/>
         <w:rPr>
-          <w:rFonts w:ascii="Arial Narrow" w:hAnsi="Arial Narrow" w:cs="Arial Narrow"/>
-          <w:sz w:val="20"/>
-          <w:szCs w:val="20"/>
-        </w:rPr>
-      </w:pPr>
-      <w:r>
-        <w:rPr>
-          <w:rFonts w:ascii="Arial Narrow" w:hAnsi="Arial Narrow" w:cs="Arial Narrow"/>
-          <w:sz w:val="20"/>
-          <w:szCs w:val="20"/>
+          <w:rFonts w:ascii="Arial" w:hAnsi="Arial" w:cs="Arial"/>
+          <w:sz w:val="16"/>
+          <w:szCs w:val="16"/>
+        </w:rPr>
+      </w:pPr>
+      <w:r>
+        <w:rPr>
+          <w:rFonts w:ascii="Arial" w:hAnsi="Arial" w:cs="Arial"/>
+          <w:sz w:val="16"/>
+          <w:szCs w:val="16"/>
         </w:rPr>
         <w:t xml:space="preserve">C.c.  Archivo</w:t>
       </w:r>
@@ -1163,18 +1251,27 @@
         <w:spacing w:after="0" w:line="240" w:lineRule="auto"/>
         <w:jc w:val="left"/>
         <w:rPr>
-          <w:rFonts w:ascii="Arial Narrow" w:hAnsi="Arial Narrow" w:cs="Arial Narrow"/>
-          <w:sz w:val="20"/>
-          <w:szCs w:val="20"/>
-        </w:rPr>
-      </w:pPr>
-      <w:r>
-        <w:rPr>
-          <w:rFonts w:ascii="Arial Narrow" w:hAnsi="Arial Narrow" w:cs="Arial Narrow"/>
-          <w:sz w:val="20"/>
-          <w:szCs w:val="20"/>
-        </w:rPr>
-        <w:t xml:space="preserve">Elaborado por: {elaborado}</w:t>
+          <w:rFonts w:ascii="Arial" w:hAnsi="Arial" w:cs="Arial"/>
+          <w:sz w:val="16"/>
+          <w:szCs w:val="16"/>
+        </w:rPr>
+      </w:pPr>
+      <w:r>
+        <w:rPr>
+          <w:rFonts w:ascii="Arial" w:hAnsi="Arial" w:cs="Arial"/>
+          <w:b/>
+          <w:sz w:val="16"/>
+          <w:szCs w:val="16"/>
+        </w:rPr>
+        <w:t xml:space="preserve">Elaborado por: </w:t>
+      </w:r>
+      <w:r>
+        <w:rPr>
+          <w:rFonts w:ascii="Arial" w:hAnsi="Arial" w:cs="Arial"/>
+          <w:sz w:val="16"/>
+          <w:szCs w:val="16"/>
+        </w:rPr>
+        <w:t xml:space="preserve">{elaborado}</w:t>
       </w:r>
     </w:p>
     <w:p>
@@ -1183,16 +1280,16 @@
         <w:spacing w:after="0" w:line="240" w:lineRule="auto"/>
         <w:jc w:val="left"/>
         <w:rPr>
-          <w:rFonts w:ascii="Arial Narrow" w:hAnsi="Arial Narrow" w:cs="Arial Narrow"/>
-          <w:sz w:val="20"/>
-          <w:szCs w:val="20"/>
-        </w:rPr>
-      </w:pPr>
-      <w:r>
-        <w:rPr>
-          <w:rFonts w:ascii="Arial Narrow" w:hAnsi="Arial Narrow" w:cs="Arial Narrow"/>
-          <w:sz w:val="20"/>
-          <w:szCs w:val="20"/>
+          <w:rFonts w:ascii="Arial" w:hAnsi="Arial" w:cs="Arial"/>
+          <w:sz w:val="16"/>
+          <w:szCs w:val="16"/>
+        </w:rPr>
+      </w:pPr>
+      <w:r>
+        <w:rPr>
+          <w:rFonts w:ascii="Arial" w:hAnsi="Arial" w:cs="Arial"/>
+          <w:sz w:val="16"/>
+          <w:szCs w:val="16"/>
         </w:rPr>
         <w:t xml:space="preserve">{iniciales}</w:t>
       </w:r>

</xml_diff>

<commit_message>
Memo: respetar interlineado y espacios del formato manual
- Interlineado 1.15x (line=276) como el memo hecho a mano; antes salia
  demasiado pegado.
- Espacio entre las filas del bloque destinatario (A/DE/Asunto/Referencia)
  para que respiren como en el original.
- Mas espacio entre los parentesis de "Folios: (        )" ya que el numero
  se coloca a mano.
- Se compacta el area de firma (el bloque EXP flota anclado al pie) para que
  memos con varios postores sigan cabiendo en una pagina.

Co-Authored-By: Claude Opus 4.8 <noreply@anthropic.com>
Claude-Session: https://claude.ai/code/session_01S69ej8Vgbpjdhn84ABgydA
</commit_message>
<xml_diff>
--- a/plantilla/MEMO_VALIDACION.docx
+++ b/plantilla/MEMO_VALIDACION.docx
@@ -4,7 +4,7 @@
   <w:body>
     <w:p>
       <w:pPr>
-        <w:spacing w:after="0" w:line="240" w:lineRule="auto"/>
+        <w:spacing w:after="0" w:line="276" w:lineRule="auto"/>
         <w:jc w:val="center"/>
         <w:rPr>
           <w:rFonts w:ascii="Cambria" w:hAnsi="Cambria" w:cs="Cambria"/>
@@ -59,7 +59,7 @@
           </w:tcPr>
           <w:p>
             <w:pPr>
-              <w:spacing w:after="0" w:line="240" w:lineRule="auto"/>
+              <w:spacing w:after="0" w:line="276" w:lineRule="auto"/>
               <w:jc w:val="left"/>
               <w:rPr>
                 <w:rFonts w:ascii="Arial Narrow" w:hAnsi="Arial Narrow" w:cs="Arial Narrow"/>
@@ -84,7 +84,7 @@
           </w:tcPr>
           <w:p>
             <w:pPr>
-              <w:spacing w:after="0" w:line="240" w:lineRule="auto"/>
+              <w:spacing w:after="0" w:line="276" w:lineRule="auto"/>
               <w:jc w:val="left"/>
               <w:rPr>
                 <w:rFonts w:ascii="Arial Narrow" w:hAnsi="Arial Narrow" w:cs="Arial Narrow"/>
@@ -109,7 +109,7 @@
           </w:tcPr>
           <w:p>
             <w:pPr>
-              <w:spacing w:after="0" w:line="240" w:lineRule="auto"/>
+              <w:spacing w:after="0" w:line="276" w:lineRule="auto"/>
               <w:jc w:val="left"/>
               <w:rPr>
                 <w:rFonts w:ascii="Arial" w:hAnsi="Arial" w:cs="Arial"/>
@@ -130,7 +130,7 @@
           </w:p>
           <w:p>
             <w:pPr>
-              <w:spacing w:after="0" w:line="240" w:lineRule="auto"/>
+              <w:spacing w:after="150" w:line="276" w:lineRule="auto"/>
               <w:jc w:val="left"/>
               <w:rPr>
                 <w:rFonts w:ascii="Arial" w:hAnsi="Arial" w:cs="Arial"/>
@@ -159,7 +159,7 @@
           </w:tcPr>
           <w:p>
             <w:pPr>
-              <w:spacing w:after="0" w:line="240" w:lineRule="auto"/>
+              <w:spacing w:after="0" w:line="276" w:lineRule="auto"/>
               <w:jc w:val="left"/>
               <w:rPr>
                 <w:rFonts w:ascii="Arial Narrow" w:hAnsi="Arial Narrow" w:cs="Arial Narrow"/>
@@ -184,7 +184,7 @@
           </w:tcPr>
           <w:p>
             <w:pPr>
-              <w:spacing w:after="0" w:line="240" w:lineRule="auto"/>
+              <w:spacing w:after="0" w:line="276" w:lineRule="auto"/>
               <w:jc w:val="left"/>
               <w:rPr>
                 <w:rFonts w:ascii="Arial Narrow" w:hAnsi="Arial Narrow" w:cs="Arial Narrow"/>
@@ -209,7 +209,7 @@
           </w:tcPr>
           <w:p>
             <w:pPr>
-              <w:spacing w:after="0" w:line="240" w:lineRule="auto"/>
+              <w:spacing w:after="0" w:line="276" w:lineRule="auto"/>
               <w:jc w:val="left"/>
               <w:rPr>
                 <w:rFonts w:ascii="Arial" w:hAnsi="Arial" w:cs="Arial"/>
@@ -230,7 +230,7 @@
           </w:p>
           <w:p>
             <w:pPr>
-              <w:spacing w:after="0" w:line="240" w:lineRule="auto"/>
+              <w:spacing w:after="150" w:line="276" w:lineRule="auto"/>
               <w:jc w:val="left"/>
               <w:rPr>
                 <w:rFonts w:ascii="Arial Narrow" w:hAnsi="Arial Narrow" w:cs="Arial Narrow"/>
@@ -257,7 +257,7 @@
           </w:tcPr>
           <w:p>
             <w:pPr>
-              <w:spacing w:after="0" w:line="240" w:lineRule="auto"/>
+              <w:spacing w:after="0" w:line="276" w:lineRule="auto"/>
               <w:jc w:val="left"/>
               <w:rPr>
                 <w:rFonts w:ascii="Arial Narrow" w:hAnsi="Arial Narrow" w:cs="Arial Narrow"/>
@@ -282,7 +282,7 @@
           </w:tcPr>
           <w:p>
             <w:pPr>
-              <w:spacing w:after="0" w:line="240" w:lineRule="auto"/>
+              <w:spacing w:after="0" w:line="276" w:lineRule="auto"/>
               <w:jc w:val="left"/>
               <w:rPr>
                 <w:rFonts w:ascii="Arial Narrow" w:hAnsi="Arial Narrow" w:cs="Arial Narrow"/>
@@ -307,7 +307,7 @@
           </w:tcPr>
           <w:p>
             <w:pPr>
-              <w:spacing w:after="0" w:line="240" w:lineRule="auto"/>
+              <w:spacing w:after="150" w:line="276" w:lineRule="auto"/>
               <w:jc w:val="left"/>
               <w:rPr>
                 <w:rFonts w:ascii="Arial Narrow" w:hAnsi="Arial Narrow" w:cs="Arial Narrow"/>
@@ -334,7 +334,7 @@
           </w:tcPr>
           <w:p>
             <w:pPr>
-              <w:spacing w:after="0" w:line="240" w:lineRule="auto"/>
+              <w:spacing w:after="0" w:line="276" w:lineRule="auto"/>
               <w:jc w:val="left"/>
               <w:rPr>
                 <w:rFonts w:ascii="Arial Narrow" w:hAnsi="Arial Narrow" w:cs="Arial Narrow"/>
@@ -359,7 +359,7 @@
           </w:tcPr>
           <w:p>
             <w:pPr>
-              <w:spacing w:after="0" w:line="240" w:lineRule="auto"/>
+              <w:spacing w:after="0" w:line="276" w:lineRule="auto"/>
               <w:jc w:val="left"/>
               <w:rPr>
                 <w:rFonts w:ascii="Arial Narrow" w:hAnsi="Arial Narrow" w:cs="Arial Narrow"/>
@@ -384,7 +384,7 @@
           </w:tcPr>
           <w:p>
             <w:pPr>
-              <w:spacing w:after="0" w:line="240" w:lineRule="auto"/>
+              <w:spacing w:after="150" w:line="276" w:lineRule="auto"/>
               <w:jc w:val="left"/>
               <w:rPr>
                 <w:rFonts w:ascii="Arial Narrow" w:hAnsi="Arial Narrow" w:cs="Arial Narrow"/>
@@ -412,7 +412,7 @@
           </w:tcPr>
           <w:p>
             <w:pPr>
-              <w:spacing w:after="0" w:line="240" w:lineRule="auto"/>
+              <w:spacing w:after="0" w:line="276" w:lineRule="auto"/>
               <w:jc w:val="left"/>
               <w:rPr>
                 <w:rFonts w:ascii="Arial Narrow" w:hAnsi="Arial Narrow" w:cs="Arial Narrow"/>
@@ -437,7 +437,7 @@
           </w:tcPr>
           <w:p>
             <w:pPr>
-              <w:spacing w:after="0" w:line="240" w:lineRule="auto"/>
+              <w:spacing w:after="0" w:line="276" w:lineRule="auto"/>
               <w:jc w:val="left"/>
               <w:rPr>
                 <w:rFonts w:ascii="Arial Narrow" w:hAnsi="Arial Narrow" w:cs="Arial Narrow"/>
@@ -462,7 +462,7 @@
           </w:tcPr>
           <w:p>
             <w:pPr>
-              <w:spacing w:after="0" w:line="240" w:lineRule="auto"/>
+              <w:spacing w:after="0" w:line="276" w:lineRule="auto"/>
               <w:jc w:val="left"/>
               <w:rPr>
                 <w:rFonts w:ascii="Arial Narrow" w:hAnsi="Arial Narrow" w:cs="Arial Narrow"/>
@@ -484,7 +484,7 @@
     </w:tbl>
     <w:p>
       <w:pPr>
-        <w:spacing w:after="0" w:line="240" w:lineRule="auto"/>
+        <w:spacing w:after="0" w:line="276" w:lineRule="auto"/>
         <w:rPr>
           <w:rFonts w:ascii="Arial" w:hAnsi="Arial" w:cs="Arial"/>
           <w:sz w:val="14"/>
@@ -497,7 +497,7 @@
         <w:pBdr>
           <w:bottom w:val="single" w:sz="18" w:space="1" w:color="auto"/>
         </w:pBdr>
-        <w:spacing w:after="0" w:line="240" w:lineRule="auto"/>
+        <w:spacing w:after="0" w:line="276" w:lineRule="auto"/>
         <w:rPr>
           <w:rFonts w:ascii="Arial" w:hAnsi="Arial" w:cs="Arial"/>
           <w:sz w:val="14"/>
@@ -507,7 +507,7 @@
     </w:p>
     <w:p>
       <w:pPr>
-        <w:spacing w:after="0" w:line="240" w:lineRule="auto"/>
+        <w:spacing w:after="0" w:line="276" w:lineRule="auto"/>
         <w:rPr>
           <w:rFonts w:ascii="Arial" w:hAnsi="Arial" w:cs="Arial"/>
           <w:sz w:val="14"/>
@@ -517,7 +517,7 @@
     </w:p>
     <w:p>
       <w:pPr>
-        <w:spacing w:after="0" w:line="240" w:lineRule="auto"/>
+        <w:spacing w:after="0" w:line="276" w:lineRule="auto"/>
         <w:jc w:val="both"/>
         <w:rPr>
           <w:rFonts w:ascii="Arial" w:hAnsi="Arial" w:cs="Arial"/>
@@ -604,7 +604,7 @@
     </w:p>
     <w:p>
       <w:pPr>
-        <w:spacing w:after="0" w:line="240" w:lineRule="auto"/>
+        <w:spacing w:after="0" w:line="276" w:lineRule="auto"/>
         <w:rPr>
           <w:rFonts w:ascii="Arial" w:hAnsi="Arial" w:cs="Arial"/>
           <w:sz w:val="14"/>
@@ -640,7 +640,7 @@
           </w:tcPr>
           <w:p>
             <w:pPr>
-              <w:spacing w:after="0" w:line="240" w:lineRule="auto"/>
+              <w:spacing w:after="0" w:line="276" w:lineRule="auto"/>
               <w:jc w:val="center"/>
               <w:rPr>
                 <w:rFonts w:ascii="Arial" w:hAnsi="Arial" w:cs="Arial"/>
@@ -668,7 +668,7 @@
           </w:tcPr>
           <w:p>
             <w:pPr>
-              <w:spacing w:after="0" w:line="240" w:lineRule="auto"/>
+              <w:spacing w:after="0" w:line="276" w:lineRule="auto"/>
               <w:jc w:val="center"/>
               <w:rPr>
                 <w:rFonts w:ascii="Arial" w:hAnsi="Arial" w:cs="Arial"/>
@@ -696,7 +696,7 @@
           </w:tcPr>
           <w:p>
             <w:pPr>
-              <w:spacing w:after="0" w:line="240" w:lineRule="auto"/>
+              <w:spacing w:after="0" w:line="276" w:lineRule="auto"/>
               <w:jc w:val="center"/>
               <w:rPr>
                 <w:rFonts w:ascii="Arial" w:hAnsi="Arial" w:cs="Arial"/>
@@ -724,7 +724,7 @@
           </w:tcPr>
           <w:p>
             <w:pPr>
-              <w:spacing w:after="0" w:line="240" w:lineRule="auto"/>
+              <w:spacing w:after="0" w:line="276" w:lineRule="auto"/>
               <w:jc w:val="center"/>
               <w:rPr>
                 <w:rFonts w:ascii="Arial" w:hAnsi="Arial" w:cs="Arial"/>
@@ -753,7 +753,7 @@
           </w:tcPr>
           <w:p>
             <w:pPr>
-              <w:spacing w:after="0" w:line="240" w:lineRule="auto"/>
+              <w:spacing w:after="0" w:line="276" w:lineRule="auto"/>
               <w:jc w:val="center"/>
               <w:rPr>
                 <w:rFonts w:ascii="Arial" w:hAnsi="Arial" w:cs="Arial"/>
@@ -780,7 +780,7 @@
           </w:tcPr>
           <w:p>
             <w:pPr>
-              <w:spacing w:after="0" w:line="240" w:lineRule="auto"/>
+              <w:spacing w:after="0" w:line="276" w:lineRule="auto"/>
               <w:jc w:val="center"/>
               <w:rPr>
                 <w:rFonts w:ascii="Arial" w:hAnsi="Arial" w:cs="Arial"/>
@@ -807,7 +807,7 @@
           </w:tcPr>
           <w:p>
             <w:pPr>
-              <w:spacing w:after="0" w:line="240" w:lineRule="auto"/>
+              <w:spacing w:after="0" w:line="276" w:lineRule="auto"/>
               <w:jc w:val="center"/>
               <w:rPr>
                 <w:rFonts w:ascii="Arial" w:hAnsi="Arial" w:cs="Arial"/>
@@ -834,7 +834,7 @@
           </w:tcPr>
           <w:p>
             <w:pPr>
-              <w:spacing w:after="0" w:line="240" w:lineRule="auto"/>
+              <w:spacing w:after="0" w:line="276" w:lineRule="auto"/>
               <w:jc w:val="center"/>
               <w:rPr>
                 <w:rFonts w:ascii="Arial" w:hAnsi="Arial" w:cs="Arial"/>
@@ -858,7 +858,7 @@
     </w:tbl>
     <w:p>
       <w:pPr>
-        <w:spacing w:after="0" w:line="240" w:lineRule="auto"/>
+        <w:spacing w:after="0" w:line="276" w:lineRule="auto"/>
         <w:rPr>
           <w:rFonts w:ascii="Arial" w:hAnsi="Arial" w:cs="Arial"/>
           <w:sz w:val="14"/>
@@ -868,7 +868,7 @@
     </w:p>
     <w:p>
       <w:pPr>
-        <w:spacing w:after="0" w:line="240" w:lineRule="auto"/>
+        <w:spacing w:after="0" w:line="276" w:lineRule="auto"/>
         <w:jc w:val="both"/>
         <w:rPr>
           <w:rFonts w:ascii="Arial" w:hAnsi="Arial" w:cs="Arial"/>
@@ -887,7 +887,7 @@
     </w:p>
     <w:p>
       <w:pPr>
-        <w:spacing w:after="0" w:line="240" w:lineRule="auto"/>
+        <w:spacing w:after="0" w:line="276" w:lineRule="auto"/>
         <w:rPr>
           <w:rFonts w:ascii="Arial" w:hAnsi="Arial" w:cs="Arial"/>
           <w:sz w:val="14"/>
@@ -897,7 +897,7 @@
     </w:p>
     <w:p>
       <w:pPr>
-        <w:spacing w:after="0" w:line="240" w:lineRule="auto"/>
+        <w:spacing w:after="0" w:line="276" w:lineRule="auto"/>
         <w:jc w:val="both"/>
         <w:rPr>
           <w:rFonts w:ascii="Arial" w:hAnsi="Arial" w:cs="Arial"/>
@@ -980,7 +980,7 @@
     </w:p>
     <w:p>
       <w:pPr>
-        <w:spacing w:after="0" w:line="240" w:lineRule="auto"/>
+        <w:spacing w:after="0" w:line="276" w:lineRule="auto"/>
         <w:rPr>
           <w:rFonts w:ascii="Arial" w:hAnsi="Arial" w:cs="Arial"/>
           <w:sz w:val="14"/>
@@ -990,7 +990,7 @@
     </w:p>
     <w:p>
       <w:pPr>
-        <w:spacing w:after="0" w:line="240" w:lineRule="auto"/>
+        <w:spacing w:after="0" w:line="276" w:lineRule="auto"/>
         <w:jc w:val="both"/>
         <w:rPr>
           <w:rFonts w:ascii="Arial" w:hAnsi="Arial" w:cs="Arial"/>
@@ -1011,7 +1011,7 @@
     </w:p>
     <w:p>
       <w:pPr>
-        <w:spacing w:after="0" w:line="240" w:lineRule="auto"/>
+        <w:spacing w:after="0" w:line="276" w:lineRule="auto"/>
         <w:rPr>
           <w:rFonts w:ascii="Arial" w:hAnsi="Arial" w:cs="Arial"/>
           <w:sz w:val="14"/>
@@ -1021,7 +1021,7 @@
     </w:p>
     <w:p>
       <w:pPr>
-        <w:spacing w:after="0" w:line="240" w:lineRule="auto"/>
+        <w:spacing w:after="0" w:line="276" w:lineRule="auto"/>
         <w:jc w:val="both"/>
         <w:rPr>
           <w:rFonts w:ascii="Arial" w:hAnsi="Arial" w:cs="Arial"/>
@@ -1060,7 +1060,7 @@
     </w:p>
     <w:p>
       <w:pPr>
-        <w:spacing w:after="0" w:line="240" w:lineRule="auto"/>
+        <w:spacing w:after="0" w:line="276" w:lineRule="auto"/>
         <w:rPr>
           <w:rFonts w:ascii="Arial" w:hAnsi="Arial" w:cs="Arial"/>
           <w:sz w:val="14"/>
@@ -1070,7 +1070,7 @@
     </w:p>
     <w:p>
       <w:pPr>
-        <w:spacing w:after="0" w:line="240" w:lineRule="auto"/>
+        <w:spacing w:after="0" w:line="276" w:lineRule="auto"/>
         <w:jc w:val="both"/>
         <w:rPr>
           <w:rFonts w:ascii="Arial" w:hAnsi="Arial" w:cs="Arial"/>
@@ -1089,7 +1089,7 @@
     </w:p>
     <w:p>
       <w:pPr>
-        <w:spacing w:after="0" w:line="240" w:lineRule="auto"/>
+        <w:spacing w:after="0" w:line="276" w:lineRule="auto"/>
         <w:rPr>
           <w:rFonts w:ascii="Arial" w:hAnsi="Arial" w:cs="Arial"/>
           <w:sz w:val="14"/>
@@ -1099,7 +1099,7 @@
     </w:p>
     <w:p>
       <w:pPr>
-        <w:spacing w:after="0" w:line="240" w:lineRule="auto"/>
+        <w:spacing w:after="0" w:line="276" w:lineRule="auto"/>
         <w:jc w:val="left"/>
         <w:rPr>
           <w:rFonts w:ascii="Arial" w:hAnsi="Arial" w:cs="Arial"/>
@@ -1118,7 +1118,7 @@
     </w:p>
     <w:p>
       <w:pPr>
-        <w:spacing w:after="0" w:line="240" w:lineRule="auto"/>
+        <w:spacing w:after="0" w:line="276" w:lineRule="auto"/>
         <w:rPr>
           <w:rFonts w:ascii="Arial" w:hAnsi="Arial" w:cs="Arial"/>
           <w:sz w:val="14"/>
@@ -1128,28 +1128,8 @@
     </w:p>
     <w:p>
       <w:pPr>
-        <w:spacing w:after="0" w:line="240" w:lineRule="auto"/>
-        <w:rPr>
-          <w:rFonts w:ascii="Arial" w:hAnsi="Arial" w:cs="Arial"/>
-          <w:sz w:val="14"/>
-          <w:szCs w:val="14"/>
-        </w:rPr>
-      </w:pPr>
-    </w:p>
-    <w:p>
-      <w:pPr>
-        <w:spacing w:after="0" w:line="240" w:lineRule="auto"/>
-        <w:rPr>
-          <w:rFonts w:ascii="Arial" w:hAnsi="Arial" w:cs="Arial"/>
-          <w:sz w:val="14"/>
-          <w:szCs w:val="14"/>
-        </w:rPr>
-      </w:pPr>
-    </w:p>
-    <w:p>
-      <w:pPr>
-        <w:framePr w:w="9000" w:h="1400" w:hRule="atLeast" w:wrap="around" w:vAnchor="margin" w:hAnchor="margin" w:x="0" w:yAlign="bottom"/>
-        <w:spacing w:after="0" w:line="240" w:lineRule="auto"/>
+        <w:framePr w:w="9000" w:h="1200" w:hRule="atLeast" w:wrap="around" w:vAnchor="margin" w:hAnchor="margin" w:x="0" w:yAlign="bottom"/>
+        <w:spacing w:after="0" w:line="276" w:lineRule="auto"/>
         <w:jc w:val="left"/>
         <w:rPr>
           <w:rFonts w:ascii="Arial" w:hAnsi="Arial" w:cs="Arial"/>
@@ -1169,8 +1149,8 @@
     </w:p>
     <w:p>
       <w:pPr>
-        <w:framePr w:w="9000" w:h="1400" w:hRule="atLeast" w:wrap="around" w:vAnchor="margin" w:hAnchor="margin" w:x="0" w:yAlign="bottom"/>
-        <w:spacing w:after="0" w:line="240" w:lineRule="auto"/>
+        <w:framePr w:w="9000" w:h="1200" w:hRule="atLeast" w:wrap="around" w:vAnchor="margin" w:hAnchor="margin" w:x="0" w:yAlign="bottom"/>
+        <w:spacing w:after="0" w:line="276" w:lineRule="auto"/>
         <w:jc w:val="left"/>
         <w:rPr>
           <w:rFonts w:ascii="Arial" w:hAnsi="Arial" w:cs="Arial"/>
@@ -1190,8 +1170,8 @@
     </w:p>
     <w:p>
       <w:pPr>
-        <w:framePr w:w="9000" w:h="1400" w:hRule="atLeast" w:wrap="around" w:vAnchor="margin" w:hAnchor="margin" w:x="0" w:yAlign="bottom"/>
-        <w:spacing w:after="0" w:line="240" w:lineRule="auto"/>
+        <w:framePr w:w="9000" w:h="1200" w:hRule="atLeast" w:wrap="around" w:vAnchor="margin" w:hAnchor="margin" w:x="0" w:yAlign="bottom"/>
+        <w:spacing w:after="0" w:line="276" w:lineRule="auto"/>
         <w:jc w:val="left"/>
         <w:rPr>
           <w:rFonts w:ascii="Arial" w:hAnsi="Arial" w:cs="Arial"/>
@@ -1214,7 +1194,7 @@
           <w:sz w:val="16"/>
           <w:szCs w:val="16"/>
         </w:rPr>
-        <w:t xml:space="preserve">( {folios} )</w:t>
+        <w:t xml:space="preserve">(        {folios}        )</w:t>
       </w:r>
       <w:r>
         <w:rPr>
@@ -1227,8 +1207,8 @@
     </w:p>
     <w:p>
       <w:pPr>
-        <w:framePr w:w="9000" w:h="1400" w:hRule="atLeast" w:wrap="around" w:vAnchor="margin" w:hAnchor="margin" w:x="0" w:yAlign="bottom"/>
-        <w:spacing w:after="0" w:line="240" w:lineRule="auto"/>
+        <w:framePr w:w="9000" w:h="1200" w:hRule="atLeast" w:wrap="around" w:vAnchor="margin" w:hAnchor="margin" w:x="0" w:yAlign="bottom"/>
+        <w:spacing w:after="0" w:line="276" w:lineRule="auto"/>
         <w:jc w:val="left"/>
         <w:rPr>
           <w:rFonts w:ascii="Arial" w:hAnsi="Arial" w:cs="Arial"/>
@@ -1247,8 +1227,8 @@
     </w:p>
     <w:p>
       <w:pPr>
-        <w:framePr w:w="9000" w:h="1400" w:hRule="atLeast" w:wrap="around" w:vAnchor="margin" w:hAnchor="margin" w:x="0" w:yAlign="bottom"/>
-        <w:spacing w:after="0" w:line="240" w:lineRule="auto"/>
+        <w:framePr w:w="9000" w:h="1200" w:hRule="atLeast" w:wrap="around" w:vAnchor="margin" w:hAnchor="margin" w:x="0" w:yAlign="bottom"/>
+        <w:spacing w:after="0" w:line="276" w:lineRule="auto"/>
         <w:jc w:val="left"/>
         <w:rPr>
           <w:rFonts w:ascii="Arial" w:hAnsi="Arial" w:cs="Arial"/>
@@ -1276,8 +1256,8 @@
     </w:p>
     <w:p>
       <w:pPr>
-        <w:framePr w:w="9000" w:h="1400" w:hRule="atLeast" w:wrap="around" w:vAnchor="margin" w:hAnchor="margin" w:x="0" w:yAlign="bottom"/>
-        <w:spacing w:after="0" w:line="240" w:lineRule="auto"/>
+        <w:framePr w:w="9000" w:h="1200" w:hRule="atLeast" w:wrap="around" w:vAnchor="margin" w:hAnchor="margin" w:x="0" w:yAlign="bottom"/>
+        <w:spacing w:after="0" w:line="276" w:lineRule="auto"/>
         <w:jc w:val="left"/>
         <w:rPr>
           <w:rFonts w:ascii="Arial" w:hAnsi="Arial" w:cs="Arial"/>

</xml_diff>

<commit_message>
Memo: el objeto sale como "ADQUISICION DE ..." / "SERVICIO DE ..."
El cuadro de validacion solo pide el bien ("4 LETREROS DE ACRILICO..."), y el
memo lo citaba tal cual: se solicita el "4 LETREROS...". El memo oficial dice
se solicita la "ADQUISICION DE 4 LETREROS...".

- conPrefijoObjeto() antepone ADQUISICION DE / SERVICIO DE segun bien o
  servicio, y no lo repite si el texto ya lo trae.
- articuloObjeto() concuerda el articulo: la "ADQUISICION..." / el "SERVICIO...".
  La plantilla pasa de tener "el" fijo a un campo {articulo}.
- abreviarObjeto() reconoce el prefijo con tilde, para que no se cuele en el
  nombre del archivo.

Verificado contra un memo real: el texto generado sale identico.

Co-Authored-By: Claude Opus 5 <noreply@anthropic.com>
Claude-Session: https://claude.ai/code/session_01S69ej8Vgbpjdhn84ABgydA
</commit_message>
<xml_diff>
--- a/plantilla/MEMO_VALIDACION.docx
+++ b/plantilla/MEMO_VALIDACION.docx
@@ -514,7 +514,15 @@
           <w:sz w:val="16"/>
           <w:szCs w:val="16"/>
         </w:rPr>
-        <w:t xml:space="preserve">Por medio del presente me dirijo a usted, para saludarla cordialmente, y en atención al documento de la referencia, mediante el cual se solicita el </w:t>
+        <w:t xml:space="preserve">Por medio del presente me dirijo a usted, para saludarla cordialmente, y en atención al documento de la referencia, mediante el cual se solicita </w:t>
+      </w:r>
+      <w:r>
+        <w:rPr>
+          <w:rFonts w:ascii="Arial" w:hAnsi="Arial" w:cs="Arial"/>
+          <w:sz w:val="16"/>
+          <w:szCs w:val="16"/>
+        </w:rPr>
+        <w:t xml:space="preserve">{articulo} </w:t>
       </w:r>
       <w:r>
         <w:rPr>

</xml_diff>